<commit_message>
User guide (EN): explain the inside pages (Store Profile, Store Leader Profile, Action Center Detail, Report Detail)
Co-Authored-By: Claude Sonnet 5.5 <noreply@anthropic.com>
Claude-Session: https://claude.ai/code/session_019dELNUNjVMr3Ja2mUwBrCu
</commit_message>
<xml_diff>
--- a/docs/user-guide/en/pages/11-scorecard.docx
+++ b/docs/user-guide/en/pages/11-scorecard.docx
@@ -889,6 +889,1306 @@
         <w:t xml:space="preserve">For each Operation Consultant, Operation Manager, Senior Operation Consultant and Operation Director: how many Store Leaders they oversee, how many of those leaders are "flagged" (performing poorly on the ranking above) and what percentage that represents.</w:t>
       </w:r>
     </w:p>
+    <w:p>
+      <w:pPr>
+        <w:pStyle w:val="Heading2"/>
+        <w:pageBreakBefore/>
+      </w:pPr>
+      <w:r>
+        <w:t xml:space="preserve">Inside a Store Leader (Store Leader Profile)</w:t>
+      </w:r>
+    </w:p>
+    <w:p>
+      <w:pPr>
+        <w:spacing w:after="90" w:line="290"/>
+      </w:pPr>
+      <w:r>
+        <w:rPr>
+          <w:rFonts w:ascii="Arial" w:cs="Arial" w:eastAsia="Arial" w:hAnsi="Arial"/>
+          <w:color w:val="27251F"/>
+          <w:sz w:val="21"/>
+          <w:szCs w:val="21"/>
+        </w:rPr>
+        <w:t xml:space="preserve">Click a Store Leader's name in the ranking to open their own page, called Store Leader Tracking. It gives the complete history, performance, workforce movement and exit sentiment for that one leader, across every store they have led. Use "Back to Scorecard" at the top to return.</w:t>
+      </w:r>
+    </w:p>
+    <w:p>
+      <w:pPr>
+        <w:keepNext/>
+        <w:spacing w:after="120" w:before="60"/>
+        <w:jc w:val="center"/>
+      </w:pPr>
+      <w:r>
+        <w:drawing>
+          <wp:inline distT="0" distB="0" distL="0" distR="0">
+            <wp:extent cx="5715000" cy="581025"/>
+            <wp:effectExtent t="0" r="0" b="0" l="0"/>
+            <wp:docPr id="1" name="" descr="" title=""/>
+            <wp:cNvGraphicFramePr>
+              <a:graphicFrameLocks xmlns:a="http://schemas.openxmlformats.org/drawingml/2006/main" noChangeAspect="1"/>
+            </wp:cNvGraphicFramePr>
+            <a:graphic xmlns:a="http://schemas.openxmlformats.org/drawingml/2006/main">
+              <a:graphicData uri="http://schemas.openxmlformats.org/drawingml/2006/picture">
+                <pic:pic xmlns:pic="http://schemas.openxmlformats.org/drawingml/2006/picture">
+                  <pic:nvPicPr>
+                    <pic:cNvPr id="0" name="" descr=""/>
+                    <pic:cNvPicPr>
+                      <a:picLocks noChangeAspect="1" noChangeArrowheads="1"/>
+                    </pic:cNvPicPr>
+                  </pic:nvPicPr>
+                  <pic:blipFill>
+                    <a:blip r:embed="rId20" cstate="none"/>
+                    <a:srcRect/>
+                    <a:stretch>
+                      <a:fillRect/>
+                    </a:stretch>
+                  </pic:blipFill>
+                  <pic:spPr bwMode="auto">
+                    <a:xfrm>
+                      <a:off x="0" y="0"/>
+                      <a:ext cx="5715000" cy="581025"/>
+                    </a:xfrm>
+                    <a:prstGeom prst="rect">
+                      <a:avLst/>
+                    </a:prstGeom>
+                  </pic:spPr>
+                </pic:pic>
+              </a:graphicData>
+            </a:graphic>
+          </wp:inline>
+        </w:drawing>
+      </w:r>
+    </w:p>
+    <w:tbl>
+      <w:tblPr>
+        <w:tblW w:type="dxa" w:w="9399"/>
+        <w:jc w:val="center"/>
+        <w:tblBorders>
+          <w:top w:val="single" w:color="auto" w:sz="4"/>
+          <w:left w:val="single" w:color="auto" w:sz="4"/>
+          <w:bottom w:val="single" w:color="auto" w:sz="4"/>
+          <w:right w:val="single" w:color="auto" w:sz="4"/>
+          <w:insideH w:val="single" w:color="auto" w:sz="4"/>
+          <w:insideV w:val="single" w:color="auto" w:sz="4"/>
+        </w:tblBorders>
+      </w:tblPr>
+      <w:tblGrid>
+        <w:gridCol w:w="3133"/>
+        <w:gridCol w:w="3133"/>
+        <w:gridCol w:w="3133"/>
+      </w:tblGrid>
+      <w:tr>
+        <w:trPr>
+          <w:cantSplit/>
+        </w:trPr>
+        <w:tc>
+          <w:tcPr>
+            <w:tcW w:type="dxa" w:w="3133"/>
+            <w:tcBorders>
+              <w:top w:val="none" w:color="FFFFFF" w:sz="0"/>
+              <w:left w:val="none" w:color="FFFFFF" w:sz="0"/>
+              <w:bottom w:val="none" w:color="FFFFFF" w:sz="0"/>
+              <w:right w:val="none" w:color="FFFFFF" w:sz="0"/>
+            </w:tcBorders>
+            <w:tcMar>
+              <w:top w:type="dxa" w:w="40"/>
+              <w:left w:type="dxa" w:w="40"/>
+              <w:bottom w:type="dxa" w:w="80"/>
+              <w:right w:type="dxa" w:w="40"/>
+            </w:tcMar>
+          </w:tcPr>
+          <w:p>
+            <w:pPr>
+              <w:jc w:val="center"/>
+            </w:pPr>
+            <w:r>
+              <w:drawing>
+                <wp:inline distT="0" distB="0" distL="0" distR="0">
+                  <wp:extent cx="1809750" cy="1343025"/>
+                  <wp:effectExtent t="0" r="0" b="0" l="0"/>
+                  <wp:docPr id="1" name="" descr="" title=""/>
+                  <wp:cNvGraphicFramePr>
+                    <a:graphicFrameLocks xmlns:a="http://schemas.openxmlformats.org/drawingml/2006/main" noChangeAspect="1"/>
+                  </wp:cNvGraphicFramePr>
+                  <a:graphic xmlns:a="http://schemas.openxmlformats.org/drawingml/2006/main">
+                    <a:graphicData uri="http://schemas.openxmlformats.org/drawingml/2006/picture">
+                      <pic:pic xmlns:pic="http://schemas.openxmlformats.org/drawingml/2006/picture">
+                        <pic:nvPicPr>
+                          <pic:cNvPr id="0" name="" descr=""/>
+                          <pic:cNvPicPr>
+                            <a:picLocks noChangeAspect="1" noChangeArrowheads="1"/>
+                          </pic:cNvPicPr>
+                        </pic:nvPicPr>
+                        <pic:blipFill>
+                          <a:blip r:embed="rId21" cstate="none"/>
+                          <a:srcRect/>
+                          <a:stretch>
+                            <a:fillRect/>
+                          </a:stretch>
+                        </pic:blipFill>
+                        <pic:spPr bwMode="auto">
+                          <a:xfrm>
+                            <a:off x="0" y="0"/>
+                            <a:ext cx="1809750" cy="1343025"/>
+                          </a:xfrm>
+                          <a:prstGeom prst="rect">
+                            <a:avLst/>
+                          </a:prstGeom>
+                        </pic:spPr>
+                      </pic:pic>
+                    </a:graphicData>
+                  </a:graphic>
+                </wp:inline>
+              </w:drawing>
+            </w:r>
+          </w:p>
+        </w:tc>
+        <w:tc>
+          <w:tcPr>
+            <w:tcW w:type="dxa" w:w="3133"/>
+            <w:tcBorders>
+              <w:top w:val="none" w:color="FFFFFF" w:sz="0"/>
+              <w:left w:val="none" w:color="FFFFFF" w:sz="0"/>
+              <w:bottom w:val="none" w:color="FFFFFF" w:sz="0"/>
+              <w:right w:val="none" w:color="FFFFFF" w:sz="0"/>
+            </w:tcBorders>
+            <w:tcMar>
+              <w:top w:type="dxa" w:w="40"/>
+              <w:left w:type="dxa" w:w="40"/>
+              <w:bottom w:type="dxa" w:w="80"/>
+              <w:right w:type="dxa" w:w="40"/>
+            </w:tcMar>
+          </w:tcPr>
+          <w:p>
+            <w:pPr>
+              <w:jc w:val="center"/>
+            </w:pPr>
+            <w:r>
+              <w:drawing>
+                <wp:inline distT="0" distB="0" distL="0" distR="0">
+                  <wp:extent cx="1809750" cy="1343025"/>
+                  <wp:effectExtent t="0" r="0" b="0" l="0"/>
+                  <wp:docPr id="1" name="" descr="" title=""/>
+                  <wp:cNvGraphicFramePr>
+                    <a:graphicFrameLocks xmlns:a="http://schemas.openxmlformats.org/drawingml/2006/main" noChangeAspect="1"/>
+                  </wp:cNvGraphicFramePr>
+                  <a:graphic xmlns:a="http://schemas.openxmlformats.org/drawingml/2006/main">
+                    <a:graphicData uri="http://schemas.openxmlformats.org/drawingml/2006/picture">
+                      <pic:pic xmlns:pic="http://schemas.openxmlformats.org/drawingml/2006/picture">
+                        <pic:nvPicPr>
+                          <pic:cNvPr id="0" name="" descr=""/>
+                          <pic:cNvPicPr>
+                            <a:picLocks noChangeAspect="1" noChangeArrowheads="1"/>
+                          </pic:cNvPicPr>
+                        </pic:nvPicPr>
+                        <pic:blipFill>
+                          <a:blip r:embed="rId22" cstate="none"/>
+                          <a:srcRect/>
+                          <a:stretch>
+                            <a:fillRect/>
+                          </a:stretch>
+                        </pic:blipFill>
+                        <pic:spPr bwMode="auto">
+                          <a:xfrm>
+                            <a:off x="0" y="0"/>
+                            <a:ext cx="1809750" cy="1343025"/>
+                          </a:xfrm>
+                          <a:prstGeom prst="rect">
+                            <a:avLst/>
+                          </a:prstGeom>
+                        </pic:spPr>
+                      </pic:pic>
+                    </a:graphicData>
+                  </a:graphic>
+                </wp:inline>
+              </w:drawing>
+            </w:r>
+          </w:p>
+        </w:tc>
+        <w:tc>
+          <w:tcPr>
+            <w:tcW w:type="dxa" w:w="3133"/>
+            <w:tcBorders>
+              <w:top w:val="none" w:color="FFFFFF" w:sz="0"/>
+              <w:left w:val="none" w:color="FFFFFF" w:sz="0"/>
+              <w:bottom w:val="none" w:color="FFFFFF" w:sz="0"/>
+              <w:right w:val="none" w:color="FFFFFF" w:sz="0"/>
+            </w:tcBorders>
+            <w:tcMar>
+              <w:top w:type="dxa" w:w="40"/>
+              <w:left w:type="dxa" w:w="40"/>
+              <w:bottom w:type="dxa" w:w="80"/>
+              <w:right w:type="dxa" w:w="40"/>
+            </w:tcMar>
+          </w:tcPr>
+          <w:p>
+            <w:pPr>
+              <w:jc w:val="center"/>
+            </w:pPr>
+            <w:r>
+              <w:drawing>
+                <wp:inline distT="0" distB="0" distL="0" distR="0">
+                  <wp:extent cx="1809750" cy="1343025"/>
+                  <wp:effectExtent t="0" r="0" b="0" l="0"/>
+                  <wp:docPr id="1" name="" descr="" title=""/>
+                  <wp:cNvGraphicFramePr>
+                    <a:graphicFrameLocks xmlns:a="http://schemas.openxmlformats.org/drawingml/2006/main" noChangeAspect="1"/>
+                  </wp:cNvGraphicFramePr>
+                  <a:graphic xmlns:a="http://schemas.openxmlformats.org/drawingml/2006/main">
+                    <a:graphicData uri="http://schemas.openxmlformats.org/drawingml/2006/picture">
+                      <pic:pic xmlns:pic="http://schemas.openxmlformats.org/drawingml/2006/picture">
+                        <pic:nvPicPr>
+                          <pic:cNvPr id="0" name="" descr=""/>
+                          <pic:cNvPicPr>
+                            <a:picLocks noChangeAspect="1" noChangeArrowheads="1"/>
+                          </pic:cNvPicPr>
+                        </pic:nvPicPr>
+                        <pic:blipFill>
+                          <a:blip r:embed="rId23" cstate="none"/>
+                          <a:srcRect/>
+                          <a:stretch>
+                            <a:fillRect/>
+                          </a:stretch>
+                        </pic:blipFill>
+                        <pic:spPr bwMode="auto">
+                          <a:xfrm>
+                            <a:off x="0" y="0"/>
+                            <a:ext cx="1809750" cy="1343025"/>
+                          </a:xfrm>
+                          <a:prstGeom prst="rect">
+                            <a:avLst/>
+                          </a:prstGeom>
+                        </pic:spPr>
+                      </pic:pic>
+                    </a:graphicData>
+                  </a:graphic>
+                </wp:inline>
+              </w:drawing>
+            </w:r>
+          </w:p>
+        </w:tc>
+      </w:tr>
+      <w:tr>
+        <w:trPr>
+          <w:cantSplit/>
+        </w:trPr>
+        <w:tc>
+          <w:tcPr>
+            <w:tcW w:type="dxa" w:w="3133"/>
+            <w:tcBorders>
+              <w:top w:val="none" w:color="FFFFFF" w:sz="0"/>
+              <w:left w:val="none" w:color="FFFFFF" w:sz="0"/>
+              <w:bottom w:val="none" w:color="FFFFFF" w:sz="0"/>
+              <w:right w:val="none" w:color="FFFFFF" w:sz="0"/>
+            </w:tcBorders>
+            <w:tcMar>
+              <w:top w:type="dxa" w:w="40"/>
+              <w:left w:type="dxa" w:w="40"/>
+              <w:bottom w:type="dxa" w:w="80"/>
+              <w:right w:type="dxa" w:w="40"/>
+            </w:tcMar>
+          </w:tcPr>
+          <w:p>
+            <w:pPr>
+              <w:jc w:val="center"/>
+            </w:pPr>
+            <w:r>
+              <w:drawing>
+                <wp:inline distT="0" distB="0" distL="0" distR="0">
+                  <wp:extent cx="1809750" cy="1343025"/>
+                  <wp:effectExtent t="0" r="0" b="0" l="0"/>
+                  <wp:docPr id="1" name="" descr="" title=""/>
+                  <wp:cNvGraphicFramePr>
+                    <a:graphicFrameLocks xmlns:a="http://schemas.openxmlformats.org/drawingml/2006/main" noChangeAspect="1"/>
+                  </wp:cNvGraphicFramePr>
+                  <a:graphic xmlns:a="http://schemas.openxmlformats.org/drawingml/2006/main">
+                    <a:graphicData uri="http://schemas.openxmlformats.org/drawingml/2006/picture">
+                      <pic:pic xmlns:pic="http://schemas.openxmlformats.org/drawingml/2006/picture">
+                        <pic:nvPicPr>
+                          <pic:cNvPr id="0" name="" descr=""/>
+                          <pic:cNvPicPr>
+                            <a:picLocks noChangeAspect="1" noChangeArrowheads="1"/>
+                          </pic:cNvPicPr>
+                        </pic:nvPicPr>
+                        <pic:blipFill>
+                          <a:blip r:embed="rId24" cstate="none"/>
+                          <a:srcRect/>
+                          <a:stretch>
+                            <a:fillRect/>
+                          </a:stretch>
+                        </pic:blipFill>
+                        <pic:spPr bwMode="auto">
+                          <a:xfrm>
+                            <a:off x="0" y="0"/>
+                            <a:ext cx="1809750" cy="1343025"/>
+                          </a:xfrm>
+                          <a:prstGeom prst="rect">
+                            <a:avLst/>
+                          </a:prstGeom>
+                        </pic:spPr>
+                      </pic:pic>
+                    </a:graphicData>
+                  </a:graphic>
+                </wp:inline>
+              </w:drawing>
+            </w:r>
+          </w:p>
+        </w:tc>
+        <w:tc>
+          <w:tcPr>
+            <w:tcW w:type="dxa" w:w="3133"/>
+            <w:tcBorders>
+              <w:top w:val="none" w:color="FFFFFF" w:sz="0"/>
+              <w:left w:val="none" w:color="FFFFFF" w:sz="0"/>
+              <w:bottom w:val="none" w:color="FFFFFF" w:sz="0"/>
+              <w:right w:val="none" w:color="FFFFFF" w:sz="0"/>
+            </w:tcBorders>
+            <w:tcMar>
+              <w:top w:type="dxa" w:w="40"/>
+              <w:left w:type="dxa" w:w="40"/>
+              <w:bottom w:type="dxa" w:w="80"/>
+              <w:right w:type="dxa" w:w="40"/>
+            </w:tcMar>
+          </w:tcPr>
+          <w:p>
+            <w:pPr>
+              <w:jc w:val="center"/>
+            </w:pPr>
+            <w:r>
+              <w:drawing>
+                <wp:inline distT="0" distB="0" distL="0" distR="0">
+                  <wp:extent cx="1809750" cy="1343025"/>
+                  <wp:effectExtent t="0" r="0" b="0" l="0"/>
+                  <wp:docPr id="1" name="" descr="" title=""/>
+                  <wp:cNvGraphicFramePr>
+                    <a:graphicFrameLocks xmlns:a="http://schemas.openxmlformats.org/drawingml/2006/main" noChangeAspect="1"/>
+                  </wp:cNvGraphicFramePr>
+                  <a:graphic xmlns:a="http://schemas.openxmlformats.org/drawingml/2006/main">
+                    <a:graphicData uri="http://schemas.openxmlformats.org/drawingml/2006/picture">
+                      <pic:pic xmlns:pic="http://schemas.openxmlformats.org/drawingml/2006/picture">
+                        <pic:nvPicPr>
+                          <pic:cNvPr id="0" name="" descr=""/>
+                          <pic:cNvPicPr>
+                            <a:picLocks noChangeAspect="1" noChangeArrowheads="1"/>
+                          </pic:cNvPicPr>
+                        </pic:nvPicPr>
+                        <pic:blipFill>
+                          <a:blip r:embed="rId25" cstate="none"/>
+                          <a:srcRect/>
+                          <a:stretch>
+                            <a:fillRect/>
+                          </a:stretch>
+                        </pic:blipFill>
+                        <pic:spPr bwMode="auto">
+                          <a:xfrm>
+                            <a:off x="0" y="0"/>
+                            <a:ext cx="1809750" cy="1343025"/>
+                          </a:xfrm>
+                          <a:prstGeom prst="rect">
+                            <a:avLst/>
+                          </a:prstGeom>
+                        </pic:spPr>
+                      </pic:pic>
+                    </a:graphicData>
+                  </a:graphic>
+                </wp:inline>
+              </w:drawing>
+            </w:r>
+          </w:p>
+        </w:tc>
+        <w:tc>
+          <w:tcPr>
+            <w:tcW w:type="dxa" w:w="3133"/>
+            <w:tcBorders>
+              <w:top w:val="none" w:color="FFFFFF" w:sz="0"/>
+              <w:left w:val="none" w:color="FFFFFF" w:sz="0"/>
+              <w:bottom w:val="none" w:color="FFFFFF" w:sz="0"/>
+              <w:right w:val="none" w:color="FFFFFF" w:sz="0"/>
+            </w:tcBorders>
+            <w:tcMar>
+              <w:top w:type="dxa" w:w="40"/>
+              <w:left w:type="dxa" w:w="40"/>
+              <w:bottom w:type="dxa" w:w="80"/>
+              <w:right w:type="dxa" w:w="40"/>
+            </w:tcMar>
+          </w:tcPr>
+          <w:p/>
+        </w:tc>
+      </w:tr>
+    </w:tbl>
+    <w:p>
+      <w:pPr>
+        <w:spacing w:after="40"/>
+      </w:pPr>
+      <w:r>
+        <w:rPr>
+          <w:rFonts w:ascii="Arial" w:cs="Arial" w:eastAsia="Arial" w:hAnsi="Arial"/>
+          <w:color w:val="27251F"/>
+          <w:sz w:val="21"/>
+          <w:szCs w:val="21"/>
+        </w:rPr>
+        <w:t xml:space="preserve"/>
+      </w:r>
+    </w:p>
+    <w:p>
+      <w:pPr>
+        <w:spacing w:after="90" w:line="290"/>
+      </w:pPr>
+      <w:r>
+        <w:rPr>
+          <w:rFonts w:ascii="Arial" w:cs="Arial" w:eastAsia="Arial" w:hAnsi="Arial"/>
+          <w:color w:val="27251F"/>
+          <w:sz w:val="21"/>
+          <w:szCs w:val="21"/>
+        </w:rPr>
+        <w:t xml:space="preserve">The five cards repeat the four scorecard metrics (Turnover, 90-Day, 180-Day retention and Exit Sentiment) plus the headcount, with the underlying counts such as the number of resignations and exit responses beneath each one.</w:t>
+      </w:r>
+    </w:p>
+    <w:p>
+      <w:pPr>
+        <w:pStyle w:val="Heading2"/>
+      </w:pPr>
+      <w:r>
+        <w:t xml:space="preserve">Turnover and headcount, store by store</w:t>
+      </w:r>
+    </w:p>
+    <w:p>
+      <w:pPr>
+        <w:keepNext/>
+        <w:spacing w:after="120" w:before="60"/>
+        <w:jc w:val="center"/>
+      </w:pPr>
+      <w:r>
+        <w:drawing>
+          <wp:inline distT="0" distB="0" distL="0" distR="0">
+            <wp:extent cx="5715000" cy="2752725"/>
+            <wp:effectExtent t="0" r="0" b="0" l="0"/>
+            <wp:docPr id="1" name="" descr="" title=""/>
+            <wp:cNvGraphicFramePr>
+              <a:graphicFrameLocks xmlns:a="http://schemas.openxmlformats.org/drawingml/2006/main" noChangeAspect="1"/>
+            </wp:cNvGraphicFramePr>
+            <a:graphic xmlns:a="http://schemas.openxmlformats.org/drawingml/2006/main">
+              <a:graphicData uri="http://schemas.openxmlformats.org/drawingml/2006/picture">
+                <pic:pic xmlns:pic="http://schemas.openxmlformats.org/drawingml/2006/picture">
+                  <pic:nvPicPr>
+                    <pic:cNvPr id="0" name="" descr=""/>
+                    <pic:cNvPicPr>
+                      <a:picLocks noChangeAspect="1" noChangeArrowheads="1"/>
+                    </pic:cNvPicPr>
+                  </pic:nvPicPr>
+                  <pic:blipFill>
+                    <a:blip r:embed="rId26" cstate="none"/>
+                    <a:srcRect/>
+                    <a:stretch>
+                      <a:fillRect/>
+                    </a:stretch>
+                  </pic:blipFill>
+                  <pic:spPr bwMode="auto">
+                    <a:xfrm>
+                      <a:off x="0" y="0"/>
+                      <a:ext cx="5715000" cy="2752725"/>
+                    </a:xfrm>
+                    <a:prstGeom prst="rect">
+                      <a:avLst/>
+                    </a:prstGeom>
+                  </pic:spPr>
+                </pic:pic>
+              </a:graphicData>
+            </a:graphic>
+          </wp:inline>
+        </w:drawing>
+      </w:r>
+    </w:p>
+    <w:p>
+      <w:pPr>
+        <w:spacing w:after="90" w:line="290"/>
+      </w:pPr>
+      <w:r>
+        <w:rPr>
+          <w:rFonts w:ascii="Arial" w:cs="Arial" w:eastAsia="Arial" w:hAnsi="Arial"/>
+          <w:color w:val="27251F"/>
+          <w:sz w:val="21"/>
+          <w:szCs w:val="21"/>
+        </w:rPr>
+        <w:t xml:space="preserve">Monthly performance across every store assignment. A marker shows where the leader was transferred between stores, so a change in the rate can be told apart from a change of store.</w:t>
+      </w:r>
+    </w:p>
+    <w:p>
+      <w:pPr>
+        <w:keepNext/>
+        <w:spacing w:after="120" w:before="60"/>
+        <w:jc w:val="center"/>
+      </w:pPr>
+      <w:r>
+        <w:drawing>
+          <wp:inline distT="0" distB="0" distL="0" distR="0">
+            <wp:extent cx="5715000" cy="3857625"/>
+            <wp:effectExtent t="0" r="0" b="0" l="0"/>
+            <wp:docPr id="1" name="" descr="" title=""/>
+            <wp:cNvGraphicFramePr>
+              <a:graphicFrameLocks xmlns:a="http://schemas.openxmlformats.org/drawingml/2006/main" noChangeAspect="1"/>
+            </wp:cNvGraphicFramePr>
+            <a:graphic xmlns:a="http://schemas.openxmlformats.org/drawingml/2006/main">
+              <a:graphicData uri="http://schemas.openxmlformats.org/drawingml/2006/picture">
+                <pic:pic xmlns:pic="http://schemas.openxmlformats.org/drawingml/2006/picture">
+                  <pic:nvPicPr>
+                    <pic:cNvPr id="0" name="" descr=""/>
+                    <pic:cNvPicPr>
+                      <a:picLocks noChangeAspect="1" noChangeArrowheads="1"/>
+                    </pic:cNvPicPr>
+                  </pic:nvPicPr>
+                  <pic:blipFill>
+                    <a:blip r:embed="rId27" cstate="none"/>
+                    <a:srcRect/>
+                    <a:stretch>
+                      <a:fillRect/>
+                    </a:stretch>
+                  </pic:blipFill>
+                  <pic:spPr bwMode="auto">
+                    <a:xfrm>
+                      <a:off x="0" y="0"/>
+                      <a:ext cx="5715000" cy="3857625"/>
+                    </a:xfrm>
+                    <a:prstGeom prst="rect">
+                      <a:avLst/>
+                    </a:prstGeom>
+                  </pic:spPr>
+                </pic:pic>
+              </a:graphicData>
+            </a:graphic>
+          </wp:inline>
+        </w:drawing>
+      </w:r>
+    </w:p>
+    <w:p>
+      <w:pPr>
+        <w:spacing w:after="90" w:line="290"/>
+      </w:pPr>
+      <w:r>
+        <w:rPr>
+          <w:rFonts w:ascii="Arial" w:cs="Arial" w:eastAsia="Arial" w:hAnsi="Arial"/>
+          <w:color w:val="27251F"/>
+          <w:sz w:val="21"/>
+          <w:szCs w:val="21"/>
+        </w:rPr>
+        <w:t xml:space="preserve">The store assignment history lists each store, period, headcount and turnover for the leader. Transfers are highlighted in the timeline.</w:t>
+      </w:r>
+    </w:p>
+    <w:p>
+      <w:pPr>
+        <w:pStyle w:val="Heading2"/>
+      </w:pPr>
+      <w:r>
+        <w:t xml:space="preserve">What leaving employees say about this leader's stores</w:t>
+      </w:r>
+    </w:p>
+    <w:p>
+      <w:pPr>
+        <w:spacing w:after="90" w:line="290"/>
+      </w:pPr>
+      <w:r>
+        <w:rPr>
+          <w:rFonts w:ascii="Arial" w:cs="Arial" w:eastAsia="Arial" w:hAnsi="Arial"/>
+          <w:color w:val="27251F"/>
+          <w:sz w:val="21"/>
+          <w:szCs w:val="21"/>
+        </w:rPr>
+        <w:t xml:space="preserve">Anonymous exit-interview signals for the stores this leader runs.</w:t>
+      </w:r>
+    </w:p>
+    <w:p>
+      <w:pPr>
+        <w:keepNext/>
+        <w:spacing w:after="120" w:before="60"/>
+        <w:jc w:val="center"/>
+      </w:pPr>
+      <w:r>
+        <w:drawing>
+          <wp:inline distT="0" distB="0" distL="0" distR="0">
+            <wp:extent cx="5715000" cy="2914650"/>
+            <wp:effectExtent t="0" r="0" b="0" l="0"/>
+            <wp:docPr id="1" name="" descr="" title=""/>
+            <wp:cNvGraphicFramePr>
+              <a:graphicFrameLocks xmlns:a="http://schemas.openxmlformats.org/drawingml/2006/main" noChangeAspect="1"/>
+            </wp:cNvGraphicFramePr>
+            <a:graphic xmlns:a="http://schemas.openxmlformats.org/drawingml/2006/main">
+              <a:graphicData uri="http://schemas.openxmlformats.org/drawingml/2006/picture">
+                <pic:pic xmlns:pic="http://schemas.openxmlformats.org/drawingml/2006/picture">
+                  <pic:nvPicPr>
+                    <pic:cNvPr id="0" name="" descr=""/>
+                    <pic:cNvPicPr>
+                      <a:picLocks noChangeAspect="1" noChangeArrowheads="1"/>
+                    </pic:cNvPicPr>
+                  </pic:nvPicPr>
+                  <pic:blipFill>
+                    <a:blip r:embed="rId28" cstate="none"/>
+                    <a:srcRect/>
+                    <a:stretch>
+                      <a:fillRect/>
+                    </a:stretch>
+                  </pic:blipFill>
+                  <pic:spPr bwMode="auto">
+                    <a:xfrm>
+                      <a:off x="0" y="0"/>
+                      <a:ext cx="5715000" cy="2914650"/>
+                    </a:xfrm>
+                    <a:prstGeom prst="rect">
+                      <a:avLst/>
+                    </a:prstGeom>
+                  </pic:spPr>
+                </pic:pic>
+              </a:graphicData>
+            </a:graphic>
+          </wp:inline>
+        </w:drawing>
+      </w:r>
+    </w:p>
+    <w:p>
+      <w:pPr>
+        <w:spacing w:after="90" w:line="290"/>
+      </w:pPr>
+      <w:r>
+        <w:rPr>
+          <w:rFonts w:ascii="Arial" w:cs="Arial" w:eastAsia="Arial" w:hAnsi="Arial"/>
+          <w:color w:val="27251F"/>
+          <w:sz w:val="21"/>
+          <w:szCs w:val="21"/>
+        </w:rPr>
+        <w:t xml:space="preserve">Exit Sentiment: the top leaving reasons over time.</w:t>
+      </w:r>
+    </w:p>
+    <w:p>
+      <w:pPr>
+        <w:keepNext/>
+        <w:spacing w:after="120" w:before="60"/>
+        <w:jc w:val="center"/>
+      </w:pPr>
+      <w:r>
+        <w:drawing>
+          <wp:inline distT="0" distB="0" distL="0" distR="0">
+            <wp:extent cx="5715000" cy="2914650"/>
+            <wp:effectExtent t="0" r="0" b="0" l="0"/>
+            <wp:docPr id="1" name="" descr="" title=""/>
+            <wp:cNvGraphicFramePr>
+              <a:graphicFrameLocks xmlns:a="http://schemas.openxmlformats.org/drawingml/2006/main" noChangeAspect="1"/>
+            </wp:cNvGraphicFramePr>
+            <a:graphic xmlns:a="http://schemas.openxmlformats.org/drawingml/2006/main">
+              <a:graphicData uri="http://schemas.openxmlformats.org/drawingml/2006/picture">
+                <pic:pic xmlns:pic="http://schemas.openxmlformats.org/drawingml/2006/picture">
+                  <pic:nvPicPr>
+                    <pic:cNvPr id="0" name="" descr=""/>
+                    <pic:cNvPicPr>
+                      <a:picLocks noChangeAspect="1" noChangeArrowheads="1"/>
+                    </pic:cNvPicPr>
+                  </pic:nvPicPr>
+                  <pic:blipFill>
+                    <a:blip r:embed="rId29" cstate="none"/>
+                    <a:srcRect/>
+                    <a:stretch>
+                      <a:fillRect/>
+                    </a:stretch>
+                  </pic:blipFill>
+                  <pic:spPr bwMode="auto">
+                    <a:xfrm>
+                      <a:off x="0" y="0"/>
+                      <a:ext cx="5715000" cy="2914650"/>
+                    </a:xfrm>
+                    <a:prstGeom prst="rect">
+                      <a:avLst/>
+                    </a:prstGeom>
+                  </pic:spPr>
+                </pic:pic>
+              </a:graphicData>
+            </a:graphic>
+          </wp:inline>
+        </w:drawing>
+      </w:r>
+    </w:p>
+    <w:p>
+      <w:pPr>
+        <w:spacing w:after="90" w:line="290"/>
+      </w:pPr>
+      <w:r>
+        <w:rPr>
+          <w:rFonts w:ascii="Arial" w:cs="Arial" w:eastAsia="Arial" w:hAnsi="Arial"/>
+          <w:color w:val="27251F"/>
+          <w:sz w:val="21"/>
+          <w:szCs w:val="21"/>
+        </w:rPr>
+        <w:t xml:space="preserve">Reasons for Leaving: the reasons employees gave for resigning.</w:t>
+      </w:r>
+    </w:p>
+    <w:p>
+      <w:pPr>
+        <w:keepNext/>
+        <w:spacing w:after="120" w:before="60"/>
+        <w:jc w:val="center"/>
+      </w:pPr>
+      <w:r>
+        <w:drawing>
+          <wp:inline distT="0" distB="0" distL="0" distR="0">
+            <wp:extent cx="5715000" cy="5743575"/>
+            <wp:effectExtent t="0" r="0" b="0" l="0"/>
+            <wp:docPr id="1" name="" descr="" title=""/>
+            <wp:cNvGraphicFramePr>
+              <a:graphicFrameLocks xmlns:a="http://schemas.openxmlformats.org/drawingml/2006/main" noChangeAspect="1"/>
+            </wp:cNvGraphicFramePr>
+            <a:graphic xmlns:a="http://schemas.openxmlformats.org/drawingml/2006/main">
+              <a:graphicData uri="http://schemas.openxmlformats.org/drawingml/2006/picture">
+                <pic:pic xmlns:pic="http://schemas.openxmlformats.org/drawingml/2006/picture">
+                  <pic:nvPicPr>
+                    <pic:cNvPr id="0" name="" descr=""/>
+                    <pic:cNvPicPr>
+                      <a:picLocks noChangeAspect="1" noChangeArrowheads="1"/>
+                    </pic:cNvPicPr>
+                  </pic:nvPicPr>
+                  <pic:blipFill>
+                    <a:blip r:embed="rId30" cstate="none"/>
+                    <a:srcRect/>
+                    <a:stretch>
+                      <a:fillRect/>
+                    </a:stretch>
+                  </pic:blipFill>
+                  <pic:spPr bwMode="auto">
+                    <a:xfrm>
+                      <a:off x="0" y="0"/>
+                      <a:ext cx="5715000" cy="5743575"/>
+                    </a:xfrm>
+                    <a:prstGeom prst="rect">
+                      <a:avLst/>
+                    </a:prstGeom>
+                  </pic:spPr>
+                </pic:pic>
+              </a:graphicData>
+            </a:graphic>
+          </wp:inline>
+        </w:drawing>
+      </w:r>
+    </w:p>
+    <w:p>
+      <w:pPr>
+        <w:spacing w:after="90" w:line="290"/>
+      </w:pPr>
+      <w:r>
+        <w:rPr>
+          <w:rFonts w:ascii="Arial" w:cs="Arial" w:eastAsia="Arial" w:hAnsi="Arial"/>
+          <w:color w:val="27251F"/>
+          <w:sz w:val="21"/>
+          <w:szCs w:val="21"/>
+        </w:rPr>
+        <w:t xml:space="preserve">Would Return: whether leaving employees would consider coming back.</w:t>
+      </w:r>
+    </w:p>
+    <w:p>
+      <w:pPr>
+        <w:keepNext/>
+        <w:spacing w:after="120" w:before="60"/>
+        <w:jc w:val="center"/>
+      </w:pPr>
+      <w:r>
+        <w:drawing>
+          <wp:inline distT="0" distB="0" distL="0" distR="0">
+            <wp:extent cx="5715000" cy="5743575"/>
+            <wp:effectExtent t="0" r="0" b="0" l="0"/>
+            <wp:docPr id="1" name="" descr="" title=""/>
+            <wp:cNvGraphicFramePr>
+              <a:graphicFrameLocks xmlns:a="http://schemas.openxmlformats.org/drawingml/2006/main" noChangeAspect="1"/>
+            </wp:cNvGraphicFramePr>
+            <a:graphic xmlns:a="http://schemas.openxmlformats.org/drawingml/2006/main">
+              <a:graphicData uri="http://schemas.openxmlformats.org/drawingml/2006/picture">
+                <pic:pic xmlns:pic="http://schemas.openxmlformats.org/drawingml/2006/picture">
+                  <pic:nvPicPr>
+                    <pic:cNvPr id="0" name="" descr=""/>
+                    <pic:cNvPicPr>
+                      <a:picLocks noChangeAspect="1" noChangeArrowheads="1"/>
+                    </pic:cNvPicPr>
+                  </pic:nvPicPr>
+                  <pic:blipFill>
+                    <a:blip r:embed="rId31" cstate="none"/>
+                    <a:srcRect/>
+                    <a:stretch>
+                      <a:fillRect/>
+                    </a:stretch>
+                  </pic:blipFill>
+                  <pic:spPr bwMode="auto">
+                    <a:xfrm>
+                      <a:off x="0" y="0"/>
+                      <a:ext cx="5715000" cy="5743575"/>
+                    </a:xfrm>
+                    <a:prstGeom prst="rect">
+                      <a:avLst/>
+                    </a:prstGeom>
+                  </pic:spPr>
+                </pic:pic>
+              </a:graphicData>
+            </a:graphic>
+          </wp:inline>
+        </w:drawing>
+      </w:r>
+    </w:p>
+    <w:p>
+      <w:pPr>
+        <w:spacing w:after="90" w:line="290"/>
+      </w:pPr>
+      <w:r>
+        <w:rPr>
+          <w:rFonts w:ascii="Arial" w:cs="Arial" w:eastAsia="Arial" w:hAnsi="Arial"/>
+          <w:color w:val="27251F"/>
+          <w:sz w:val="21"/>
+          <w:szCs w:val="21"/>
+        </w:rPr>
+        <w:t xml:space="preserve">Overall Experience: how leaving employees rated their experience.</w:t>
+      </w:r>
+    </w:p>
+    <w:p>
+      <w:pPr>
+        <w:keepNext/>
+        <w:spacing w:after="120" w:before="60"/>
+        <w:jc w:val="center"/>
+      </w:pPr>
+      <w:r>
+        <w:drawing>
+          <wp:inline distT="0" distB="0" distL="0" distR="0">
+            <wp:extent cx="5715000" cy="5743575"/>
+            <wp:effectExtent t="0" r="0" b="0" l="0"/>
+            <wp:docPr id="1" name="" descr="" title=""/>
+            <wp:cNvGraphicFramePr>
+              <a:graphicFrameLocks xmlns:a="http://schemas.openxmlformats.org/drawingml/2006/main" noChangeAspect="1"/>
+            </wp:cNvGraphicFramePr>
+            <a:graphic xmlns:a="http://schemas.openxmlformats.org/drawingml/2006/main">
+              <a:graphicData uri="http://schemas.openxmlformats.org/drawingml/2006/picture">
+                <pic:pic xmlns:pic="http://schemas.openxmlformats.org/drawingml/2006/picture">
+                  <pic:nvPicPr>
+                    <pic:cNvPr id="0" name="" descr=""/>
+                    <pic:cNvPicPr>
+                      <a:picLocks noChangeAspect="1" noChangeArrowheads="1"/>
+                    </pic:cNvPicPr>
+                  </pic:nvPicPr>
+                  <pic:blipFill>
+                    <a:blip r:embed="rId32" cstate="none"/>
+                    <a:srcRect/>
+                    <a:stretch>
+                      <a:fillRect/>
+                    </a:stretch>
+                  </pic:blipFill>
+                  <pic:spPr bwMode="auto">
+                    <a:xfrm>
+                      <a:off x="0" y="0"/>
+                      <a:ext cx="5715000" cy="5743575"/>
+                    </a:xfrm>
+                    <a:prstGeom prst="rect">
+                      <a:avLst/>
+                    </a:prstGeom>
+                  </pic:spPr>
+                </pic:pic>
+              </a:graphicData>
+            </a:graphic>
+          </wp:inline>
+        </w:drawing>
+      </w:r>
+    </w:p>
+    <w:p>
+      <w:pPr>
+        <w:spacing w:after="90" w:line="290"/>
+      </w:pPr>
+      <w:r>
+        <w:rPr>
+          <w:rFonts w:ascii="Arial" w:cs="Arial" w:eastAsia="Arial" w:hAnsi="Arial"/>
+          <w:color w:val="27251F"/>
+          <w:sz w:val="21"/>
+          <w:szCs w:val="21"/>
+        </w:rPr>
+        <w:t xml:space="preserve">Engagement Drivers: the share who answered positively on each driver, lowest first.</w:t>
+      </w:r>
+    </w:p>
+    <w:p>
+      <w:pPr>
+        <w:keepNext/>
+        <w:spacing w:after="120" w:before="60"/>
+        <w:jc w:val="center"/>
+      </w:pPr>
+      <w:r>
+        <w:drawing>
+          <wp:inline distT="0" distB="0" distL="0" distR="0">
+            <wp:extent cx="5715000" cy="3009900"/>
+            <wp:effectExtent t="0" r="0" b="0" l="0"/>
+            <wp:docPr id="1" name="" descr="" title=""/>
+            <wp:cNvGraphicFramePr>
+              <a:graphicFrameLocks xmlns:a="http://schemas.openxmlformats.org/drawingml/2006/main" noChangeAspect="1"/>
+            </wp:cNvGraphicFramePr>
+            <a:graphic xmlns:a="http://schemas.openxmlformats.org/drawingml/2006/main">
+              <a:graphicData uri="http://schemas.openxmlformats.org/drawingml/2006/picture">
+                <pic:pic xmlns:pic="http://schemas.openxmlformats.org/drawingml/2006/picture">
+                  <pic:nvPicPr>
+                    <pic:cNvPr id="0" name="" descr=""/>
+                    <pic:cNvPicPr>
+                      <a:picLocks noChangeAspect="1" noChangeArrowheads="1"/>
+                    </pic:cNvPicPr>
+                  </pic:nvPicPr>
+                  <pic:blipFill>
+                    <a:blip r:embed="rId33" cstate="none"/>
+                    <a:srcRect/>
+                    <a:stretch>
+                      <a:fillRect/>
+                    </a:stretch>
+                  </pic:blipFill>
+                  <pic:spPr bwMode="auto">
+                    <a:xfrm>
+                      <a:off x="0" y="0"/>
+                      <a:ext cx="5715000" cy="3009900"/>
+                    </a:xfrm>
+                    <a:prstGeom prst="rect">
+                      <a:avLst/>
+                    </a:prstGeom>
+                  </pic:spPr>
+                </pic:pic>
+              </a:graphicData>
+            </a:graphic>
+          </wp:inline>
+        </w:drawing>
+      </w:r>
+    </w:p>
+    <w:p>
+      <w:pPr>
+        <w:keepNext/>
+        <w:spacing w:after="120" w:before="60"/>
+        <w:jc w:val="center"/>
+      </w:pPr>
+      <w:r>
+        <w:drawing>
+          <wp:inline distT="0" distB="0" distL="0" distR="0">
+            <wp:extent cx="5715000" cy="3009900"/>
+            <wp:effectExtent t="0" r="0" b="0" l="0"/>
+            <wp:docPr id="1" name="" descr="" title=""/>
+            <wp:cNvGraphicFramePr>
+              <a:graphicFrameLocks xmlns:a="http://schemas.openxmlformats.org/drawingml/2006/main" noChangeAspect="1"/>
+            </wp:cNvGraphicFramePr>
+            <a:graphic xmlns:a="http://schemas.openxmlformats.org/drawingml/2006/main">
+              <a:graphicData uri="http://schemas.openxmlformats.org/drawingml/2006/picture">
+                <pic:pic xmlns:pic="http://schemas.openxmlformats.org/drawingml/2006/picture">
+                  <pic:nvPicPr>
+                    <pic:cNvPr id="0" name="" descr=""/>
+                    <pic:cNvPicPr>
+                      <a:picLocks noChangeAspect="1" noChangeArrowheads="1"/>
+                    </pic:cNvPicPr>
+                  </pic:nvPicPr>
+                  <pic:blipFill>
+                    <a:blip r:embed="rId34" cstate="none"/>
+                    <a:srcRect/>
+                    <a:stretch>
+                      <a:fillRect/>
+                    </a:stretch>
+                  </pic:blipFill>
+                  <pic:spPr bwMode="auto">
+                    <a:xfrm>
+                      <a:off x="0" y="0"/>
+                      <a:ext cx="5715000" cy="3009900"/>
+                    </a:xfrm>
+                    <a:prstGeom prst="rect">
+                      <a:avLst/>
+                    </a:prstGeom>
+                  </pic:spPr>
+                </pic:pic>
+              </a:graphicData>
+            </a:graphic>
+          </wp:inline>
+        </w:drawing>
+      </w:r>
+    </w:p>
+    <w:p>
+      <w:pPr>
+        <w:keepNext/>
+        <w:spacing w:after="120" w:before="60"/>
+        <w:jc w:val="center"/>
+      </w:pPr>
+      <w:r>
+        <w:drawing>
+          <wp:inline distT="0" distB="0" distL="0" distR="0">
+            <wp:extent cx="5715000" cy="3009900"/>
+            <wp:effectExtent t="0" r="0" b="0" l="0"/>
+            <wp:docPr id="1" name="" descr="" title=""/>
+            <wp:cNvGraphicFramePr>
+              <a:graphicFrameLocks xmlns:a="http://schemas.openxmlformats.org/drawingml/2006/main" noChangeAspect="1"/>
+            </wp:cNvGraphicFramePr>
+            <a:graphic xmlns:a="http://schemas.openxmlformats.org/drawingml/2006/main">
+              <a:graphicData uri="http://schemas.openxmlformats.org/drawingml/2006/picture">
+                <pic:pic xmlns:pic="http://schemas.openxmlformats.org/drawingml/2006/picture">
+                  <pic:nvPicPr>
+                    <pic:cNvPr id="0" name="" descr=""/>
+                    <pic:cNvPicPr>
+                      <a:picLocks noChangeAspect="1" noChangeArrowheads="1"/>
+                    </pic:cNvPicPr>
+                  </pic:nvPicPr>
+                  <pic:blipFill>
+                    <a:blip r:embed="rId35" cstate="none"/>
+                    <a:srcRect/>
+                    <a:stretch>
+                      <a:fillRect/>
+                    </a:stretch>
+                  </pic:blipFill>
+                  <pic:spPr bwMode="auto">
+                    <a:xfrm>
+                      <a:off x="0" y="0"/>
+                      <a:ext cx="5715000" cy="3009900"/>
+                    </a:xfrm>
+                    <a:prstGeom prst="rect">
+                      <a:avLst/>
+                    </a:prstGeom>
+                  </pic:spPr>
+                </pic:pic>
+              </a:graphicData>
+            </a:graphic>
+          </wp:inline>
+        </w:drawing>
+      </w:r>
+    </w:p>
+    <w:p>
+      <w:pPr>
+        <w:spacing w:after="90" w:line="290"/>
+      </w:pPr>
+      <w:r>
+        <w:rPr>
+          <w:rFonts w:ascii="Arial" w:cs="Arial" w:eastAsia="Arial" w:hAnsi="Arial"/>
+          <w:color w:val="27251F"/>
+          <w:sz w:val="21"/>
+          <w:szCs w:val="21"/>
+        </w:rPr>
+        <w:t xml:space="preserve">Workload Condition, Training and Fair Treatment: how leaving employees rated each of them.</w:t>
+      </w:r>
+    </w:p>
+    <w:p>
+      <w:pPr>
+        <w:keepNext/>
+        <w:spacing w:after="120" w:before="60"/>
+        <w:jc w:val="center"/>
+      </w:pPr>
+      <w:r>
+        <w:drawing>
+          <wp:inline distT="0" distB="0" distL="0" distR="0">
+            <wp:extent cx="5715000" cy="2371725"/>
+            <wp:effectExtent t="0" r="0" b="0" l="0"/>
+            <wp:docPr id="1" name="" descr="" title=""/>
+            <wp:cNvGraphicFramePr>
+              <a:graphicFrameLocks xmlns:a="http://schemas.openxmlformats.org/drawingml/2006/main" noChangeAspect="1"/>
+            </wp:cNvGraphicFramePr>
+            <a:graphic xmlns:a="http://schemas.openxmlformats.org/drawingml/2006/main">
+              <a:graphicData uri="http://schemas.openxmlformats.org/drawingml/2006/picture">
+                <pic:pic xmlns:pic="http://schemas.openxmlformats.org/drawingml/2006/picture">
+                  <pic:nvPicPr>
+                    <pic:cNvPr id="0" name="" descr=""/>
+                    <pic:cNvPicPr>
+                      <a:picLocks noChangeAspect="1" noChangeArrowheads="1"/>
+                    </pic:cNvPicPr>
+                  </pic:nvPicPr>
+                  <pic:blipFill>
+                    <a:blip r:embed="rId36" cstate="none"/>
+                    <a:srcRect/>
+                    <a:stretch>
+                      <a:fillRect/>
+                    </a:stretch>
+                  </pic:blipFill>
+                  <pic:spPr bwMode="auto">
+                    <a:xfrm>
+                      <a:off x="0" y="0"/>
+                      <a:ext cx="5715000" cy="2371725"/>
+                    </a:xfrm>
+                    <a:prstGeom prst="rect">
+                      <a:avLst/>
+                    </a:prstGeom>
+                  </pic:spPr>
+                </pic:pic>
+              </a:graphicData>
+            </a:graphic>
+          </wp:inline>
+        </w:drawing>
+      </w:r>
+    </w:p>
+    <w:p>
+      <w:pPr>
+        <w:spacing w:after="90" w:line="290"/>
+      </w:pPr>
+      <w:r>
+        <w:rPr>
+          <w:rFonts w:ascii="Arial" w:cs="Arial" w:eastAsia="Arial" w:hAnsi="Arial"/>
+          <w:color w:val="27251F"/>
+          <w:sz w:val="21"/>
+          <w:szCs w:val="21"/>
+        </w:rPr>
+        <w:t xml:space="preserve">Leaving Reason vs Would Return: for each top reason, the share who said they would work here again.</w:t>
+      </w:r>
+    </w:p>
+    <w:p>
+      <w:pPr>
+        <w:keepNext/>
+        <w:spacing w:after="120" w:before="60"/>
+        <w:jc w:val="center"/>
+      </w:pPr>
+      <w:r>
+        <w:drawing>
+          <wp:inline distT="0" distB="0" distL="0" distR="0">
+            <wp:extent cx="5715000" cy="2371725"/>
+            <wp:effectExtent t="0" r="0" b="0" l="0"/>
+            <wp:docPr id="1" name="" descr="" title=""/>
+            <wp:cNvGraphicFramePr>
+              <a:graphicFrameLocks xmlns:a="http://schemas.openxmlformats.org/drawingml/2006/main" noChangeAspect="1"/>
+            </wp:cNvGraphicFramePr>
+            <a:graphic xmlns:a="http://schemas.openxmlformats.org/drawingml/2006/main">
+              <a:graphicData uri="http://schemas.openxmlformats.org/drawingml/2006/picture">
+                <pic:pic xmlns:pic="http://schemas.openxmlformats.org/drawingml/2006/picture">
+                  <pic:nvPicPr>
+                    <pic:cNvPr id="0" name="" descr=""/>
+                    <pic:cNvPicPr>
+                      <a:picLocks noChangeAspect="1" noChangeArrowheads="1"/>
+                    </pic:cNvPicPr>
+                  </pic:nvPicPr>
+                  <pic:blipFill>
+                    <a:blip r:embed="rId37" cstate="none"/>
+                    <a:srcRect/>
+                    <a:stretch>
+                      <a:fillRect/>
+                    </a:stretch>
+                  </pic:blipFill>
+                  <pic:spPr bwMode="auto">
+                    <a:xfrm>
+                      <a:off x="0" y="0"/>
+                      <a:ext cx="5715000" cy="2371725"/>
+                    </a:xfrm>
+                    <a:prstGeom prst="rect">
+                      <a:avLst/>
+                    </a:prstGeom>
+                  </pic:spPr>
+                </pic:pic>
+              </a:graphicData>
+            </a:graphic>
+          </wp:inline>
+        </w:drawing>
+      </w:r>
+    </w:p>
+    <w:p>
+      <w:pPr>
+        <w:spacing w:after="90" w:line="290"/>
+      </w:pPr>
+      <w:r>
+        <w:rPr>
+          <w:rFonts w:ascii="Arial" w:cs="Arial" w:eastAsia="Arial" w:hAnsi="Arial"/>
+          <w:color w:val="27251F"/>
+          <w:sz w:val="21"/>
+          <w:szCs w:val="21"/>
+        </w:rPr>
+        <w:t xml:space="preserve">Exit Responses by Job Title: the exit responses grouped by the leaving employee's job title.</w:t>
+      </w:r>
+    </w:p>
+    <w:p>
+      <w:pPr>
+        <w:keepNext/>
+        <w:spacing w:after="120" w:before="60"/>
+        <w:jc w:val="center"/>
+      </w:pPr>
+      <w:r>
+        <w:drawing>
+          <wp:inline distT="0" distB="0" distL="0" distR="0">
+            <wp:extent cx="5715000" cy="1895475"/>
+            <wp:effectExtent t="0" r="0" b="0" l="0"/>
+            <wp:docPr id="1" name="" descr="" title=""/>
+            <wp:cNvGraphicFramePr>
+              <a:graphicFrameLocks xmlns:a="http://schemas.openxmlformats.org/drawingml/2006/main" noChangeAspect="1"/>
+            </wp:cNvGraphicFramePr>
+            <a:graphic xmlns:a="http://schemas.openxmlformats.org/drawingml/2006/main">
+              <a:graphicData uri="http://schemas.openxmlformats.org/drawingml/2006/picture">
+                <pic:pic xmlns:pic="http://schemas.openxmlformats.org/drawingml/2006/picture">
+                  <pic:nvPicPr>
+                    <pic:cNvPr id="0" name="" descr=""/>
+                    <pic:cNvPicPr>
+                      <a:picLocks noChangeAspect="1" noChangeArrowheads="1"/>
+                    </pic:cNvPicPr>
+                  </pic:nvPicPr>
+                  <pic:blipFill>
+                    <a:blip r:embed="rId38" cstate="none"/>
+                    <a:srcRect/>
+                    <a:stretch>
+                      <a:fillRect/>
+                    </a:stretch>
+                  </pic:blipFill>
+                  <pic:spPr bwMode="auto">
+                    <a:xfrm>
+                      <a:off x="0" y="0"/>
+                      <a:ext cx="5715000" cy="1895475"/>
+                    </a:xfrm>
+                    <a:prstGeom prst="rect">
+                      <a:avLst/>
+                    </a:prstGeom>
+                  </pic:spPr>
+                </pic:pic>
+              </a:graphicData>
+            </a:graphic>
+          </wp:inline>
+        </w:drawing>
+      </w:r>
+    </w:p>
+    <w:p>
+      <w:pPr>
+        <w:spacing w:after="90" w:line="290"/>
+      </w:pPr>
+      <w:r>
+        <w:rPr>
+          <w:rFonts w:ascii="Arial" w:cs="Arial" w:eastAsia="Arial" w:hAnsi="Arial"/>
+          <w:color w:val="27251F"/>
+          <w:sz w:val="21"/>
+          <w:szCs w:val="21"/>
+        </w:rPr>
+        <w:t xml:space="preserve">Anonymous Exit Comments: the free-text comments left in exit interviews for this leader's stores, with the store, the question, the comment and the date.</w:t>
+      </w:r>
+    </w:p>
+    <w:p>
+      <w:pPr>
+        <w:spacing w:after="90" w:line="290"/>
+      </w:pPr>
+      <w:r>
+        <w:rPr>
+          <w:rFonts w:ascii="Arial" w:cs="Arial" w:eastAsia="Arial" w:hAnsi="Arial"/>
+          <w:b/>
+          <w:bCs/>
+          <w:color w:val="27251F"/>
+          <w:sz w:val="21"/>
+          <w:szCs w:val="21"/>
+        </w:rPr>
+        <w:t xml:space="preserve">What to look at: </w:t>
+      </w:r>
+      <w:r>
+        <w:rPr>
+          <w:rFonts w:ascii="Arial" w:cs="Arial" w:eastAsia="Arial" w:hAnsi="Arial"/>
+          <w:color w:val="27251F"/>
+          <w:sz w:val="21"/>
+          <w:szCs w:val="21"/>
+        </w:rPr>
+        <w:t xml:space="preserve">whether a drop in the leader's turnover or a rise in exit sentiment lines up with a transfer to another store.</w:t>
+      </w:r>
+    </w:p>
+    <w:p>
+      <w:pPr>
+        <w:spacing w:after="90" w:line="290"/>
+      </w:pPr>
+      <w:r>
+        <w:rPr>
+          <w:rFonts w:ascii="Arial" w:cs="Arial" w:eastAsia="Arial" w:hAnsi="Arial"/>
+          <w:b/>
+          <w:bCs/>
+          <w:color w:val="27251F"/>
+          <w:sz w:val="21"/>
+          <w:szCs w:val="21"/>
+        </w:rPr>
+        <w:t xml:space="preserve">Then decide: </w:t>
+      </w:r>
+      <w:r>
+        <w:rPr>
+          <w:rFonts w:ascii="Arial" w:cs="Arial" w:eastAsia="Arial" w:hAnsi="Arial"/>
+          <w:color w:val="27251F"/>
+          <w:sz w:val="21"/>
+          <w:szCs w:val="21"/>
+        </w:rPr>
+        <w:t xml:space="preserve">use this page to prepare a fair, evidence-based conversation with the leader and their Operation Consultant.</w:t>
+      </w:r>
+    </w:p>
     <w:sectPr>
       <w:headerReference w:type="default" r:id="rId7"/>
       <w:footerReference w:type="default" r:id="rId8"/>

</xml_diff>